<commit_message>
Add unit tests for account and audit
</commit_message>
<xml_diff>
--- a/docs/Business Rules.docx
+++ b/docs/Business Rules.docx
@@ -26676,6 +26676,159 @@
                 <w:rtl w:val="0"/>
               </w:rPr>
               <w:t xml:space="preserve">Latest user-supplied deletion policy</w:t>
+            </w:r>
+          </w:p>
+        </w:tc>
+      </w:tr>
+      <w:tr>
+        <w:trPr>
+          <w:cantSplit w:val="1"/>
+          <w:tblHeader w:val="0"/>
+        </w:trPr>
+        <w:tc>
+          <w:tcPr>
+            <w:tcBorders>
+              <w:top w:color="000000" w:space="0" w:sz="4" w:val="single"/>
+              <w:left w:color="000000" w:space="0" w:sz="4" w:val="single"/>
+              <w:bottom w:color="000000" w:space="0" w:sz="4" w:val="single"/>
+              <w:right w:color="000000" w:space="0" w:sz="4" w:val="single"/>
+            </w:tcBorders>
+            <w:tcMar>
+              <w:top w:w="100.0" w:type="dxa"/>
+              <w:left w:w="100.0" w:type="dxa"/>
+              <w:bottom w:w="100.0" w:type="dxa"/>
+              <w:right w:w="100.0" w:type="dxa"/>
+            </w:tcMar>
+          </w:tcPr>
+          <w:p>
+            <w:r>
+              <w:t>BR-119</w:t>
+            </w:r>
+          </w:p>
+        </w:tc>
+        <w:tc>
+          <w:tcPr>
+            <w:tcBorders>
+              <w:top w:color="000000" w:space="0" w:sz="4" w:val="single"/>
+              <w:left w:color="000000" w:space="0" w:sz="4" w:val="single"/>
+              <w:bottom w:color="000000" w:space="0" w:sz="4" w:val="single"/>
+              <w:right w:color="000000" w:space="0" w:sz="4" w:val="single"/>
+            </w:tcBorders>
+            <w:tcMar>
+              <w:top w:w="100.0" w:type="dxa"/>
+              <w:left w:w="100.0" w:type="dxa"/>
+              <w:bottom w:w="100.0" w:type="dxa"/>
+              <w:right w:w="100.0" w:type="dxa"/>
+            </w:tcMar>
+          </w:tcPr>
+          <w:p>
+            <w:r>
+              <w:t>An optional phone number must contain 7-15 digits after trimming, start with 0, and contain digits only; the plus sign and all formatting characters are not allowed</w:t>
+            </w:r>
+          </w:p>
+        </w:tc>
+        <w:tc>
+          <w:tcPr>
+            <w:tcBorders>
+              <w:top w:color="000000" w:space="0" w:sz="4" w:val="single"/>
+              <w:left w:color="000000" w:space="0" w:sz="4" w:val="single"/>
+              <w:bottom w:color="000000" w:space="0" w:sz="4" w:val="single"/>
+              <w:right w:color="000000" w:space="0" w:sz="4" w:val="single"/>
+            </w:tcBorders>
+            <w:tcMar>
+              <w:top w:w="100.0" w:type="dxa"/>
+              <w:left w:w="100.0" w:type="dxa"/>
+              <w:bottom w:w="100.0" w:type="dxa"/>
+              <w:right w:w="100.0" w:type="dxa"/>
+            </w:tcMar>
+          </w:tcPr>
+          <w:p>
+            <w:r>
+              <w:t>UC-03</w:t>
+            </w:r>
+          </w:p>
+        </w:tc>
+        <w:tc>
+          <w:tcPr>
+            <w:tcBorders>
+              <w:top w:color="000000" w:space="0" w:sz="4" w:val="single"/>
+              <w:left w:color="000000" w:space="0" w:sz="4" w:val="single"/>
+              <w:bottom w:color="000000" w:space="0" w:sz="4" w:val="single"/>
+              <w:right w:color="000000" w:space="0" w:sz="4" w:val="single"/>
+            </w:tcBorders>
+            <w:tcMar>
+              <w:top w:w="100.0" w:type="dxa"/>
+              <w:left w:w="100.0" w:type="dxa"/>
+              <w:bottom w:w="100.0" w:type="dxa"/>
+              <w:right w:w="100.0" w:type="dxa"/>
+            </w:tcMar>
+          </w:tcPr>
+          <w:p>
+            <w:r>
+              <w:t>Rejects malformed phone numbers and prevents unusable contact data</w:t>
+            </w:r>
+          </w:p>
+        </w:tc>
+        <w:tc>
+          <w:tcPr>
+            <w:tcBorders>
+              <w:top w:color="000000" w:space="0" w:sz="4" w:val="single"/>
+              <w:left w:color="000000" w:space="0" w:sz="4" w:val="single"/>
+              <w:bottom w:color="000000" w:space="0" w:sz="4" w:val="single"/>
+              <w:right w:color="000000" w:space="0" w:sz="4" w:val="single"/>
+            </w:tcBorders>
+            <w:tcMar>
+              <w:top w:w="100.0" w:type="dxa"/>
+              <w:left w:w="100.0" w:type="dxa"/>
+              <w:bottom w:w="100.0" w:type="dxa"/>
+              <w:right w:w="100.0" w:type="dxa"/>
+            </w:tcMar>
+          </w:tcPr>
+          <w:p>
+            <w:r>
+              <w:t>GCMB</w:t>
+            </w:r>
+          </w:p>
+        </w:tc>
+        <w:tc>
+          <w:tcPr>
+            <w:tcBorders>
+              <w:top w:color="000000" w:space="0" w:sz="4" w:val="single"/>
+              <w:left w:color="000000" w:space="0" w:sz="4" w:val="single"/>
+              <w:bottom w:color="000000" w:space="0" w:sz="4" w:val="single"/>
+              <w:right w:color="000000" w:space="0" w:sz="4" w:val="single"/>
+            </w:tcBorders>
+            <w:tcMar>
+              <w:top w:w="100.0" w:type="dxa"/>
+              <w:left w:w="100.0" w:type="dxa"/>
+              <w:bottom w:w="100.0" w:type="dxa"/>
+              <w:right w:w="100.0" w:type="dxa"/>
+            </w:tcMar>
+          </w:tcPr>
+          <w:p>
+            <w:r>
+              <w:t>Constraint</w:t>
+            </w:r>
+          </w:p>
+        </w:tc>
+        <w:tc>
+          <w:tcPr>
+            <w:tcBorders>
+              <w:top w:color="000000" w:space="0" w:sz="4" w:val="single"/>
+              <w:left w:color="000000" w:space="0" w:sz="4" w:val="single"/>
+              <w:bottom w:color="000000" w:space="0" w:sz="4" w:val="single"/>
+              <w:right w:color="000000" w:space="0" w:sz="4" w:val="single"/>
+            </w:tcBorders>
+            <w:tcMar>
+              <w:top w:w="100.0" w:type="dxa"/>
+              <w:left w:w="100.0" w:type="dxa"/>
+              <w:bottom w:w="100.0" w:type="dxa"/>
+              <w:right w:w="100.0" w:type="dxa"/>
+            </w:tcMar>
+          </w:tcPr>
+          <w:p>
+            <w:r>
+              <w:t>Latest user-supplied phone-number validation policy</w:t>
             </w:r>
           </w:p>
         </w:tc>

</xml_diff>

<commit_message>
Manual Test - UT
</commit_message>
<xml_diff>
--- a/docs/Business Rules.docx
+++ b/docs/Business Rules.docx
@@ -8,7 +8,7 @@
         <w:spacing w:after="0" w:before="40" w:line="240" w:lineRule="auto"/>
         <w:rPr/>
       </w:pPr>
-      <w:bookmarkStart w:colFirst="0" w:colLast="0" w:name="_4m2wbu6grtnz" w:id="0"/>
+      <w:bookmarkStart w:colFirst="0" w:colLast="0" w:name="_heading=h.e0lrz732quls" w:id="0"/>
       <w:bookmarkEnd w:id="0"/>
       <w:r>
         <w:rPr>
@@ -16180,7 +16180,7 @@
               </w:rPr>
               <w:t xml:space="preserve">Vietnam Labor Code 2019, Article 98;</w:t>
             </w:r>
-            <w:hyperlink r:id="rId6">
+            <w:hyperlink r:id="rId7">
               <w:r>
                 <w:rPr>
                   <w:rFonts w:ascii="Calibri" w:cs="Calibri" w:eastAsia="Calibri" w:hAnsi="Calibri"/>
@@ -26701,134 +26701,656 @@
             </w:tcMar>
           </w:tcPr>
           <w:p>
-            <w:r>
-              <w:t>BR-119</w:t>
-            </w:r>
-          </w:p>
-        </w:tc>
-        <w:tc>
-          <w:tcPr>
-            <w:tcBorders>
-              <w:top w:color="000000" w:space="0" w:sz="4" w:val="single"/>
-              <w:left w:color="000000" w:space="0" w:sz="4" w:val="single"/>
-              <w:bottom w:color="000000" w:space="0" w:sz="4" w:val="single"/>
-              <w:right w:color="000000" w:space="0" w:sz="4" w:val="single"/>
-            </w:tcBorders>
-            <w:tcMar>
-              <w:top w:w="100.0" w:type="dxa"/>
-              <w:left w:w="100.0" w:type="dxa"/>
-              <w:bottom w:w="100.0" w:type="dxa"/>
-              <w:right w:w="100.0" w:type="dxa"/>
-            </w:tcMar>
-          </w:tcPr>
-          <w:p>
-            <w:r>
-              <w:t>An optional phone number must contain 7-15 digits after trimming, start with 0, and contain digits only; the plus sign and all formatting characters are not allowed</w:t>
-            </w:r>
-          </w:p>
-        </w:tc>
-        <w:tc>
-          <w:tcPr>
-            <w:tcBorders>
-              <w:top w:color="000000" w:space="0" w:sz="4" w:val="single"/>
-              <w:left w:color="000000" w:space="0" w:sz="4" w:val="single"/>
-              <w:bottom w:color="000000" w:space="0" w:sz="4" w:val="single"/>
-              <w:right w:color="000000" w:space="0" w:sz="4" w:val="single"/>
-            </w:tcBorders>
-            <w:tcMar>
-              <w:top w:w="100.0" w:type="dxa"/>
-              <w:left w:w="100.0" w:type="dxa"/>
-              <w:bottom w:w="100.0" w:type="dxa"/>
-              <w:right w:w="100.0" w:type="dxa"/>
-            </w:tcMar>
-          </w:tcPr>
-          <w:p>
-            <w:r>
-              <w:t>UC-03</w:t>
-            </w:r>
-          </w:p>
-        </w:tc>
-        <w:tc>
-          <w:tcPr>
-            <w:tcBorders>
-              <w:top w:color="000000" w:space="0" w:sz="4" w:val="single"/>
-              <w:left w:color="000000" w:space="0" w:sz="4" w:val="single"/>
-              <w:bottom w:color="000000" w:space="0" w:sz="4" w:val="single"/>
-              <w:right w:color="000000" w:space="0" w:sz="4" w:val="single"/>
-            </w:tcBorders>
-            <w:tcMar>
-              <w:top w:w="100.0" w:type="dxa"/>
-              <w:left w:w="100.0" w:type="dxa"/>
-              <w:bottom w:w="100.0" w:type="dxa"/>
-              <w:right w:w="100.0" w:type="dxa"/>
-            </w:tcMar>
-          </w:tcPr>
-          <w:p>
-            <w:r>
-              <w:t>Rejects malformed phone numbers and prevents unusable contact data</w:t>
-            </w:r>
-          </w:p>
-        </w:tc>
-        <w:tc>
-          <w:tcPr>
-            <w:tcBorders>
-              <w:top w:color="000000" w:space="0" w:sz="4" w:val="single"/>
-              <w:left w:color="000000" w:space="0" w:sz="4" w:val="single"/>
-              <w:bottom w:color="000000" w:space="0" w:sz="4" w:val="single"/>
-              <w:right w:color="000000" w:space="0" w:sz="4" w:val="single"/>
-            </w:tcBorders>
-            <w:tcMar>
-              <w:top w:w="100.0" w:type="dxa"/>
-              <w:left w:w="100.0" w:type="dxa"/>
-              <w:bottom w:w="100.0" w:type="dxa"/>
-              <w:right w:w="100.0" w:type="dxa"/>
-            </w:tcMar>
-          </w:tcPr>
-          <w:p>
-            <w:r>
-              <w:t>GCMB</w:t>
-            </w:r>
-          </w:p>
-        </w:tc>
-        <w:tc>
-          <w:tcPr>
-            <w:tcBorders>
-              <w:top w:color="000000" w:space="0" w:sz="4" w:val="single"/>
-              <w:left w:color="000000" w:space="0" w:sz="4" w:val="single"/>
-              <w:bottom w:color="000000" w:space="0" w:sz="4" w:val="single"/>
-              <w:right w:color="000000" w:space="0" w:sz="4" w:val="single"/>
-            </w:tcBorders>
-            <w:tcMar>
-              <w:top w:w="100.0" w:type="dxa"/>
-              <w:left w:w="100.0" w:type="dxa"/>
-              <w:bottom w:w="100.0" w:type="dxa"/>
-              <w:right w:w="100.0" w:type="dxa"/>
-            </w:tcMar>
-          </w:tcPr>
-          <w:p>
-            <w:r>
-              <w:t>Constraint</w:t>
-            </w:r>
-          </w:p>
-        </w:tc>
-        <w:tc>
-          <w:tcPr>
-            <w:tcBorders>
-              <w:top w:color="000000" w:space="0" w:sz="4" w:val="single"/>
-              <w:left w:color="000000" w:space="0" w:sz="4" w:val="single"/>
-              <w:bottom w:color="000000" w:space="0" w:sz="4" w:val="single"/>
-              <w:right w:color="000000" w:space="0" w:sz="4" w:val="single"/>
-            </w:tcBorders>
-            <w:tcMar>
-              <w:top w:w="100.0" w:type="dxa"/>
-              <w:left w:w="100.0" w:type="dxa"/>
-              <w:bottom w:w="100.0" w:type="dxa"/>
-              <w:right w:w="100.0" w:type="dxa"/>
-            </w:tcMar>
-          </w:tcPr>
-          <w:p>
-            <w:r>
-              <w:t>Latest user-supplied phone-number validation policy</w:t>
+            <w:pPr>
+              <w:rPr>
+                <w:rFonts w:ascii="Calibri" w:cs="Calibri" w:eastAsia="Calibri" w:hAnsi="Calibri"/>
+              </w:rPr>
+            </w:pPr>
+            <w:r>
+              <w:rPr>
+                <w:rFonts w:ascii="Calibri" w:cs="Calibri" w:eastAsia="Calibri" w:hAnsi="Calibri"/>
+                <w:rtl w:val="0"/>
+              </w:rPr>
+              <w:t xml:space="preserve">BR-119</w:t>
+            </w:r>
+          </w:p>
+        </w:tc>
+        <w:tc>
+          <w:tcPr>
+            <w:tcBorders>
+              <w:top w:color="000000" w:space="0" w:sz="4" w:val="single"/>
+              <w:left w:color="000000" w:space="0" w:sz="4" w:val="single"/>
+              <w:bottom w:color="000000" w:space="0" w:sz="4" w:val="single"/>
+              <w:right w:color="000000" w:space="0" w:sz="4" w:val="single"/>
+            </w:tcBorders>
+            <w:tcMar>
+              <w:top w:w="100.0" w:type="dxa"/>
+              <w:left w:w="100.0" w:type="dxa"/>
+              <w:bottom w:w="100.0" w:type="dxa"/>
+              <w:right w:w="100.0" w:type="dxa"/>
+            </w:tcMar>
+          </w:tcPr>
+          <w:p>
+            <w:pPr>
+              <w:rPr>
+                <w:rFonts w:ascii="Calibri" w:cs="Calibri" w:eastAsia="Calibri" w:hAnsi="Calibri"/>
+              </w:rPr>
+            </w:pPr>
+            <w:r>
+              <w:rPr>
+                <w:rFonts w:ascii="Calibri" w:cs="Calibri" w:eastAsia="Calibri" w:hAnsi="Calibri"/>
+                <w:rtl w:val="0"/>
+              </w:rPr>
+              <w:t xml:space="preserve">An optional phone number must contain 7-15 digits after trimming, start with 0, and contain digits only; the plus sign and all formatting characters are not allowed</w:t>
+            </w:r>
+          </w:p>
+        </w:tc>
+        <w:tc>
+          <w:tcPr>
+            <w:tcBorders>
+              <w:top w:color="000000" w:space="0" w:sz="4" w:val="single"/>
+              <w:left w:color="000000" w:space="0" w:sz="4" w:val="single"/>
+              <w:bottom w:color="000000" w:space="0" w:sz="4" w:val="single"/>
+              <w:right w:color="000000" w:space="0" w:sz="4" w:val="single"/>
+            </w:tcBorders>
+            <w:tcMar>
+              <w:top w:w="100.0" w:type="dxa"/>
+              <w:left w:w="100.0" w:type="dxa"/>
+              <w:bottom w:w="100.0" w:type="dxa"/>
+              <w:right w:w="100.0" w:type="dxa"/>
+            </w:tcMar>
+          </w:tcPr>
+          <w:p>
+            <w:pPr>
+              <w:rPr>
+                <w:rFonts w:ascii="Calibri" w:cs="Calibri" w:eastAsia="Calibri" w:hAnsi="Calibri"/>
+              </w:rPr>
+            </w:pPr>
+            <w:r>
+              <w:rPr>
+                <w:rFonts w:ascii="Calibri" w:cs="Calibri" w:eastAsia="Calibri" w:hAnsi="Calibri"/>
+                <w:rtl w:val="0"/>
+              </w:rPr>
+              <w:t xml:space="preserve">UC-03</w:t>
+            </w:r>
+          </w:p>
+        </w:tc>
+        <w:tc>
+          <w:tcPr>
+            <w:tcBorders>
+              <w:top w:color="000000" w:space="0" w:sz="4" w:val="single"/>
+              <w:left w:color="000000" w:space="0" w:sz="4" w:val="single"/>
+              <w:bottom w:color="000000" w:space="0" w:sz="4" w:val="single"/>
+              <w:right w:color="000000" w:space="0" w:sz="4" w:val="single"/>
+            </w:tcBorders>
+            <w:tcMar>
+              <w:top w:w="100.0" w:type="dxa"/>
+              <w:left w:w="100.0" w:type="dxa"/>
+              <w:bottom w:w="100.0" w:type="dxa"/>
+              <w:right w:w="100.0" w:type="dxa"/>
+            </w:tcMar>
+          </w:tcPr>
+          <w:p>
+            <w:pPr>
+              <w:rPr>
+                <w:rFonts w:ascii="Calibri" w:cs="Calibri" w:eastAsia="Calibri" w:hAnsi="Calibri"/>
+              </w:rPr>
+            </w:pPr>
+            <w:r>
+              <w:rPr>
+                <w:rFonts w:ascii="Calibri" w:cs="Calibri" w:eastAsia="Calibri" w:hAnsi="Calibri"/>
+                <w:rtl w:val="0"/>
+              </w:rPr>
+              <w:t xml:space="preserve">Rejects malformed phone numbers and prevents unusable contact data</w:t>
+            </w:r>
+          </w:p>
+        </w:tc>
+        <w:tc>
+          <w:tcPr>
+            <w:tcBorders>
+              <w:top w:color="000000" w:space="0" w:sz="4" w:val="single"/>
+              <w:left w:color="000000" w:space="0" w:sz="4" w:val="single"/>
+              <w:bottom w:color="000000" w:space="0" w:sz="4" w:val="single"/>
+              <w:right w:color="000000" w:space="0" w:sz="4" w:val="single"/>
+            </w:tcBorders>
+            <w:tcMar>
+              <w:top w:w="100.0" w:type="dxa"/>
+              <w:left w:w="100.0" w:type="dxa"/>
+              <w:bottom w:w="100.0" w:type="dxa"/>
+              <w:right w:w="100.0" w:type="dxa"/>
+            </w:tcMar>
+          </w:tcPr>
+          <w:p>
+            <w:pPr>
+              <w:rPr>
+                <w:rFonts w:ascii="Calibri" w:cs="Calibri" w:eastAsia="Calibri" w:hAnsi="Calibri"/>
+              </w:rPr>
+            </w:pPr>
+            <w:r>
+              <w:rPr>
+                <w:rFonts w:ascii="Calibri" w:cs="Calibri" w:eastAsia="Calibri" w:hAnsi="Calibri"/>
+                <w:rtl w:val="0"/>
+              </w:rPr>
+              <w:t xml:space="preserve">GCMB</w:t>
+            </w:r>
+          </w:p>
+        </w:tc>
+        <w:tc>
+          <w:tcPr>
+            <w:tcBorders>
+              <w:top w:color="000000" w:space="0" w:sz="4" w:val="single"/>
+              <w:left w:color="000000" w:space="0" w:sz="4" w:val="single"/>
+              <w:bottom w:color="000000" w:space="0" w:sz="4" w:val="single"/>
+              <w:right w:color="000000" w:space="0" w:sz="4" w:val="single"/>
+            </w:tcBorders>
+            <w:tcMar>
+              <w:top w:w="100.0" w:type="dxa"/>
+              <w:left w:w="100.0" w:type="dxa"/>
+              <w:bottom w:w="100.0" w:type="dxa"/>
+              <w:right w:w="100.0" w:type="dxa"/>
+            </w:tcMar>
+          </w:tcPr>
+          <w:p>
+            <w:pPr>
+              <w:rPr>
+                <w:rFonts w:ascii="Calibri" w:cs="Calibri" w:eastAsia="Calibri" w:hAnsi="Calibri"/>
+              </w:rPr>
+            </w:pPr>
+            <w:r>
+              <w:rPr>
+                <w:rFonts w:ascii="Calibri" w:cs="Calibri" w:eastAsia="Calibri" w:hAnsi="Calibri"/>
+                <w:rtl w:val="0"/>
+              </w:rPr>
+              <w:t xml:space="preserve">Constraint</w:t>
+            </w:r>
+          </w:p>
+        </w:tc>
+        <w:tc>
+          <w:tcPr>
+            <w:tcBorders>
+              <w:top w:color="000000" w:space="0" w:sz="4" w:val="single"/>
+              <w:left w:color="000000" w:space="0" w:sz="4" w:val="single"/>
+              <w:bottom w:color="000000" w:space="0" w:sz="4" w:val="single"/>
+              <w:right w:color="000000" w:space="0" w:sz="4" w:val="single"/>
+            </w:tcBorders>
+            <w:tcMar>
+              <w:top w:w="100.0" w:type="dxa"/>
+              <w:left w:w="100.0" w:type="dxa"/>
+              <w:bottom w:w="100.0" w:type="dxa"/>
+              <w:right w:w="100.0" w:type="dxa"/>
+            </w:tcMar>
+          </w:tcPr>
+          <w:p>
+            <w:pPr>
+              <w:rPr>
+                <w:rFonts w:ascii="Calibri" w:cs="Calibri" w:eastAsia="Calibri" w:hAnsi="Calibri"/>
+              </w:rPr>
+            </w:pPr>
+            <w:r>
+              <w:rPr>
+                <w:rFonts w:ascii="Calibri" w:cs="Calibri" w:eastAsia="Calibri" w:hAnsi="Calibri"/>
+                <w:rtl w:val="0"/>
+              </w:rPr>
+              <w:t xml:space="preserve">Latest user-supplied phone-number validation policy</w:t>
+            </w:r>
+          </w:p>
+        </w:tc>
+      </w:tr>
+      <w:tr>
+        <w:trPr>
+          <w:cantSplit w:val="1"/>
+          <w:tblHeader w:val="0"/>
+        </w:trPr>
+        <w:tc>
+          <w:tcPr>
+            <w:tcBorders>
+              <w:top w:color="000000" w:space="0" w:sz="4" w:val="single"/>
+              <w:left w:color="000000" w:space="0" w:sz="4" w:val="single"/>
+              <w:bottom w:color="000000" w:space="0" w:sz="4" w:val="single"/>
+              <w:right w:color="000000" w:space="0" w:sz="4" w:val="single"/>
+            </w:tcBorders>
+            <w:tcMar>
+              <w:top w:w="100.0" w:type="dxa"/>
+              <w:left w:w="100.0" w:type="dxa"/>
+              <w:bottom w:w="100.0" w:type="dxa"/>
+              <w:right w:w="100.0" w:type="dxa"/>
+            </w:tcMar>
+          </w:tcPr>
+          <w:p>
+            <w:pPr>
+              <w:spacing w:line="240" w:lineRule="auto"/>
+              <w:rPr>
+                <w:rFonts w:ascii="Calibri" w:cs="Calibri" w:eastAsia="Calibri" w:hAnsi="Calibri"/>
+              </w:rPr>
+            </w:pPr>
+            <w:r>
+              <w:rPr>
+                <w:rFonts w:ascii="Calibri" w:cs="Calibri" w:eastAsia="Calibri" w:hAnsi="Calibri"/>
+                <w:rtl w:val="0"/>
+              </w:rPr>
+              <w:t xml:space="preserve">BR-120</w:t>
+            </w:r>
+          </w:p>
+        </w:tc>
+        <w:tc>
+          <w:tcPr>
+            <w:tcBorders>
+              <w:top w:color="000000" w:space="0" w:sz="4" w:val="single"/>
+              <w:left w:color="000000" w:space="0" w:sz="4" w:val="single"/>
+              <w:bottom w:color="000000" w:space="0" w:sz="4" w:val="single"/>
+              <w:right w:color="000000" w:space="0" w:sz="4" w:val="single"/>
+            </w:tcBorders>
+            <w:tcMar>
+              <w:top w:w="100.0" w:type="dxa"/>
+              <w:left w:w="100.0" w:type="dxa"/>
+              <w:bottom w:w="100.0" w:type="dxa"/>
+              <w:right w:w="100.0" w:type="dxa"/>
+            </w:tcMar>
+          </w:tcPr>
+          <w:p>
+            <w:pPr>
+              <w:spacing w:line="240" w:lineRule="auto"/>
+              <w:rPr>
+                <w:rFonts w:ascii="Calibri" w:cs="Calibri" w:eastAsia="Calibri" w:hAnsi="Calibri"/>
+              </w:rPr>
+            </w:pPr>
+            <w:r>
+              <w:rPr>
+                <w:rFonts w:ascii="Calibri" w:cs="Calibri" w:eastAsia="Calibri" w:hAnsi="Calibri"/>
+                <w:rtl w:val="0"/>
+              </w:rPr>
+              <w:t xml:space="preserve">The new password must match its confirmation before a password change is accepted </w:t>
+            </w:r>
+          </w:p>
+        </w:tc>
+        <w:tc>
+          <w:tcPr>
+            <w:tcBorders>
+              <w:top w:color="000000" w:space="0" w:sz="4" w:val="single"/>
+              <w:left w:color="000000" w:space="0" w:sz="4" w:val="single"/>
+              <w:bottom w:color="000000" w:space="0" w:sz="4" w:val="single"/>
+              <w:right w:color="000000" w:space="0" w:sz="4" w:val="single"/>
+            </w:tcBorders>
+            <w:tcMar>
+              <w:top w:w="100.0" w:type="dxa"/>
+              <w:left w:w="100.0" w:type="dxa"/>
+              <w:bottom w:w="100.0" w:type="dxa"/>
+              <w:right w:w="100.0" w:type="dxa"/>
+            </w:tcMar>
+          </w:tcPr>
+          <w:p>
+            <w:pPr>
+              <w:spacing w:line="240" w:lineRule="auto"/>
+              <w:rPr>
+                <w:rFonts w:ascii="Calibri" w:cs="Calibri" w:eastAsia="Calibri" w:hAnsi="Calibri"/>
+              </w:rPr>
+            </w:pPr>
+            <w:r>
+              <w:rPr>
+                <w:rFonts w:ascii="Calibri" w:cs="Calibri" w:eastAsia="Calibri" w:hAnsi="Calibri"/>
+                <w:rtl w:val="0"/>
+              </w:rPr>
+              <w:t xml:space="preserve">UC-01</w:t>
+            </w:r>
+          </w:p>
+        </w:tc>
+        <w:tc>
+          <w:tcPr>
+            <w:tcBorders>
+              <w:top w:color="000000" w:space="0" w:sz="4" w:val="single"/>
+              <w:left w:color="000000" w:space="0" w:sz="4" w:val="single"/>
+              <w:bottom w:color="000000" w:space="0" w:sz="4" w:val="single"/>
+              <w:right w:color="000000" w:space="0" w:sz="4" w:val="single"/>
+            </w:tcBorders>
+            <w:tcMar>
+              <w:top w:w="100.0" w:type="dxa"/>
+              <w:left w:w="100.0" w:type="dxa"/>
+              <w:bottom w:w="100.0" w:type="dxa"/>
+              <w:right w:w="100.0" w:type="dxa"/>
+            </w:tcMar>
+          </w:tcPr>
+          <w:p>
+            <w:pPr>
+              <w:spacing w:line="240" w:lineRule="auto"/>
+              <w:rPr>
+                <w:rFonts w:ascii="Calibri" w:cs="Calibri" w:eastAsia="Calibri" w:hAnsi="Calibri"/>
+              </w:rPr>
+            </w:pPr>
+            <w:r>
+              <w:rPr>
+                <w:rFonts w:ascii="Calibri" w:cs="Calibri" w:eastAsia="Calibri" w:hAnsi="Calibri"/>
+                <w:rtl w:val="0"/>
+              </w:rPr>
+              <w:t xml:space="preserve">Prevents unintended password changes caused by typing errors </w:t>
+            </w:r>
+          </w:p>
+        </w:tc>
+        <w:tc>
+          <w:tcPr>
+            <w:tcBorders>
+              <w:top w:color="000000" w:space="0" w:sz="4" w:val="single"/>
+              <w:left w:color="000000" w:space="0" w:sz="4" w:val="single"/>
+              <w:bottom w:color="000000" w:space="0" w:sz="4" w:val="single"/>
+              <w:right w:color="000000" w:space="0" w:sz="4" w:val="single"/>
+            </w:tcBorders>
+            <w:tcMar>
+              <w:top w:w="100.0" w:type="dxa"/>
+              <w:left w:w="100.0" w:type="dxa"/>
+              <w:bottom w:w="100.0" w:type="dxa"/>
+              <w:right w:w="100.0" w:type="dxa"/>
+            </w:tcMar>
+          </w:tcPr>
+          <w:p>
+            <w:pPr>
+              <w:spacing w:line="240" w:lineRule="auto"/>
+              <w:rPr>
+                <w:rFonts w:ascii="Calibri" w:cs="Calibri" w:eastAsia="Calibri" w:hAnsi="Calibri"/>
+              </w:rPr>
+            </w:pPr>
+            <w:r>
+              <w:rPr>
+                <w:rFonts w:ascii="Calibri" w:cs="Calibri" w:eastAsia="Calibri" w:hAnsi="Calibri"/>
+                <w:rtl w:val="0"/>
+              </w:rPr>
+              <w:t xml:space="preserve">GCMB</w:t>
+            </w:r>
+          </w:p>
+        </w:tc>
+        <w:tc>
+          <w:tcPr>
+            <w:tcBorders>
+              <w:top w:color="000000" w:space="0" w:sz="4" w:val="single"/>
+              <w:left w:color="000000" w:space="0" w:sz="4" w:val="single"/>
+              <w:bottom w:color="000000" w:space="0" w:sz="4" w:val="single"/>
+              <w:right w:color="000000" w:space="0" w:sz="4" w:val="single"/>
+            </w:tcBorders>
+            <w:tcMar>
+              <w:top w:w="100.0" w:type="dxa"/>
+              <w:left w:w="100.0" w:type="dxa"/>
+              <w:bottom w:w="100.0" w:type="dxa"/>
+              <w:right w:w="100.0" w:type="dxa"/>
+            </w:tcMar>
+          </w:tcPr>
+          <w:p>
+            <w:pPr>
+              <w:spacing w:line="240" w:lineRule="auto"/>
+              <w:rPr>
+                <w:rFonts w:ascii="Calibri" w:cs="Calibri" w:eastAsia="Calibri" w:hAnsi="Calibri"/>
+              </w:rPr>
+            </w:pPr>
+            <w:r>
+              <w:rPr>
+                <w:rFonts w:ascii="Calibri" w:cs="Calibri" w:eastAsia="Calibri" w:hAnsi="Calibri"/>
+                <w:rtl w:val="0"/>
+              </w:rPr>
+              <w:t xml:space="preserve">Constraint</w:t>
+            </w:r>
+          </w:p>
+        </w:tc>
+        <w:tc>
+          <w:tcPr>
+            <w:tcBorders>
+              <w:top w:color="000000" w:space="0" w:sz="4" w:val="single"/>
+              <w:left w:color="000000" w:space="0" w:sz="4" w:val="single"/>
+              <w:bottom w:color="000000" w:space="0" w:sz="4" w:val="single"/>
+              <w:right w:color="000000" w:space="0" w:sz="4" w:val="single"/>
+            </w:tcBorders>
+            <w:tcMar>
+              <w:top w:w="100.0" w:type="dxa"/>
+              <w:left w:w="100.0" w:type="dxa"/>
+              <w:bottom w:w="100.0" w:type="dxa"/>
+              <w:right w:w="100.0" w:type="dxa"/>
+            </w:tcMar>
+          </w:tcPr>
+          <w:p>
+            <w:pPr>
+              <w:spacing w:line="240" w:lineRule="auto"/>
+              <w:rPr>
+                <w:rFonts w:ascii="Calibri" w:cs="Calibri" w:eastAsia="Calibri" w:hAnsi="Calibri"/>
+              </w:rPr>
+            </w:pPr>
+            <w:r>
+              <w:rPr>
+                <w:rFonts w:ascii="Calibri" w:cs="Calibri" w:eastAsia="Calibri" w:hAnsi="Calibri"/>
+                <w:rtl w:val="0"/>
+              </w:rPr>
+              <w:t xml:space="preserve">Confirmed password-change requirements </w:t>
+            </w:r>
+          </w:p>
+        </w:tc>
+      </w:tr>
+      <w:tr>
+        <w:trPr>
+          <w:cantSplit w:val="1"/>
+          <w:tblHeader w:val="0"/>
+        </w:trPr>
+        <w:tc>
+          <w:tcPr>
+            <w:tcBorders>
+              <w:top w:color="000000" w:space="0" w:sz="4" w:val="single"/>
+              <w:left w:color="000000" w:space="0" w:sz="4" w:val="single"/>
+              <w:bottom w:color="000000" w:space="0" w:sz="4" w:val="single"/>
+              <w:right w:color="000000" w:space="0" w:sz="4" w:val="single"/>
+            </w:tcBorders>
+            <w:tcMar>
+              <w:top w:w="100.0" w:type="dxa"/>
+              <w:left w:w="100.0" w:type="dxa"/>
+              <w:bottom w:w="100.0" w:type="dxa"/>
+              <w:right w:w="100.0" w:type="dxa"/>
+            </w:tcMar>
+          </w:tcPr>
+          <w:p>
+            <w:pPr>
+              <w:spacing w:line="240" w:lineRule="auto"/>
+              <w:rPr>
+                <w:rFonts w:ascii="Calibri" w:cs="Calibri" w:eastAsia="Calibri" w:hAnsi="Calibri"/>
+              </w:rPr>
+            </w:pPr>
+            <w:r>
+              <w:rPr>
+                <w:rFonts w:ascii="Calibri" w:cs="Calibri" w:eastAsia="Calibri" w:hAnsi="Calibri"/>
+                <w:rtl w:val="0"/>
+              </w:rPr>
+              <w:t xml:space="preserve">BR-121</w:t>
+            </w:r>
+          </w:p>
+        </w:tc>
+        <w:tc>
+          <w:tcPr>
+            <w:tcBorders>
+              <w:top w:color="000000" w:space="0" w:sz="4" w:val="single"/>
+              <w:left w:color="000000" w:space="0" w:sz="4" w:val="single"/>
+              <w:bottom w:color="000000" w:space="0" w:sz="4" w:val="single"/>
+              <w:right w:color="000000" w:space="0" w:sz="4" w:val="single"/>
+            </w:tcBorders>
+            <w:tcMar>
+              <w:top w:w="100.0" w:type="dxa"/>
+              <w:left w:w="100.0" w:type="dxa"/>
+              <w:bottom w:w="100.0" w:type="dxa"/>
+              <w:right w:w="100.0" w:type="dxa"/>
+            </w:tcMar>
+          </w:tcPr>
+          <w:p>
+            <w:pPr>
+              <w:spacing w:line="240" w:lineRule="auto"/>
+              <w:rPr>
+                <w:rFonts w:ascii="Calibri" w:cs="Calibri" w:eastAsia="Calibri" w:hAnsi="Calibri"/>
+              </w:rPr>
+            </w:pPr>
+            <w:r>
+              <w:rPr>
+                <w:rFonts w:ascii="Calibri" w:cs="Calibri" w:eastAsia="Calibri" w:hAnsi="Calibri"/>
+                <w:rtl w:val="0"/>
+              </w:rPr>
+              <w:t xml:space="preserve">The new password must differ from the current password </w:t>
+            </w:r>
+          </w:p>
+        </w:tc>
+        <w:tc>
+          <w:tcPr>
+            <w:tcBorders>
+              <w:top w:color="000000" w:space="0" w:sz="4" w:val="single"/>
+              <w:left w:color="000000" w:space="0" w:sz="4" w:val="single"/>
+              <w:bottom w:color="000000" w:space="0" w:sz="4" w:val="single"/>
+              <w:right w:color="000000" w:space="0" w:sz="4" w:val="single"/>
+            </w:tcBorders>
+            <w:tcMar>
+              <w:top w:w="100.0" w:type="dxa"/>
+              <w:left w:w="100.0" w:type="dxa"/>
+              <w:bottom w:w="100.0" w:type="dxa"/>
+              <w:right w:w="100.0" w:type="dxa"/>
+            </w:tcMar>
+          </w:tcPr>
+          <w:p>
+            <w:pPr>
+              <w:spacing w:line="240" w:lineRule="auto"/>
+              <w:rPr>
+                <w:rFonts w:ascii="Calibri" w:cs="Calibri" w:eastAsia="Calibri" w:hAnsi="Calibri"/>
+              </w:rPr>
+            </w:pPr>
+            <w:r>
+              <w:rPr>
+                <w:rFonts w:ascii="Calibri" w:cs="Calibri" w:eastAsia="Calibri" w:hAnsi="Calibri"/>
+                <w:rtl w:val="0"/>
+              </w:rPr>
+              <w:t xml:space="preserve">UC-01</w:t>
+            </w:r>
+          </w:p>
+          <w:p>
+            <w:pPr>
+              <w:spacing w:line="240" w:lineRule="auto"/>
+              <w:rPr>
+                <w:rFonts w:ascii="Calibri" w:cs="Calibri" w:eastAsia="Calibri" w:hAnsi="Calibri"/>
+              </w:rPr>
+            </w:pPr>
+            <w:r>
+              <w:rPr>
+                <w:rtl w:val="0"/>
+              </w:rPr>
+            </w:r>
+          </w:p>
+        </w:tc>
+        <w:tc>
+          <w:tcPr>
+            <w:tcBorders>
+              <w:top w:color="000000" w:space="0" w:sz="4" w:val="single"/>
+              <w:left w:color="000000" w:space="0" w:sz="4" w:val="single"/>
+              <w:bottom w:color="000000" w:space="0" w:sz="4" w:val="single"/>
+              <w:right w:color="000000" w:space="0" w:sz="4" w:val="single"/>
+            </w:tcBorders>
+            <w:tcMar>
+              <w:top w:w="100.0" w:type="dxa"/>
+              <w:left w:w="100.0" w:type="dxa"/>
+              <w:bottom w:w="100.0" w:type="dxa"/>
+              <w:right w:w="100.0" w:type="dxa"/>
+            </w:tcMar>
+          </w:tcPr>
+          <w:p>
+            <w:pPr>
+              <w:spacing w:line="240" w:lineRule="auto"/>
+              <w:rPr>
+                <w:rFonts w:ascii="Calibri" w:cs="Calibri" w:eastAsia="Calibri" w:hAnsi="Calibri"/>
+              </w:rPr>
+            </w:pPr>
+            <w:r>
+              <w:rPr>
+                <w:rFonts w:ascii="Calibri" w:cs="Calibri" w:eastAsia="Calibri" w:hAnsi="Calibri"/>
+                <w:rtl w:val="0"/>
+              </w:rPr>
+              <w:t xml:space="preserve">Ensures a password change replaces the existing password </w:t>
+            </w:r>
+          </w:p>
+        </w:tc>
+        <w:tc>
+          <w:tcPr>
+            <w:tcBorders>
+              <w:top w:color="000000" w:space="0" w:sz="4" w:val="single"/>
+              <w:left w:color="000000" w:space="0" w:sz="4" w:val="single"/>
+              <w:bottom w:color="000000" w:space="0" w:sz="4" w:val="single"/>
+              <w:right w:color="000000" w:space="0" w:sz="4" w:val="single"/>
+            </w:tcBorders>
+            <w:tcMar>
+              <w:top w:w="100.0" w:type="dxa"/>
+              <w:left w:w="100.0" w:type="dxa"/>
+              <w:bottom w:w="100.0" w:type="dxa"/>
+              <w:right w:w="100.0" w:type="dxa"/>
+            </w:tcMar>
+          </w:tcPr>
+          <w:p>
+            <w:pPr>
+              <w:spacing w:line="240" w:lineRule="auto"/>
+              <w:rPr>
+                <w:rFonts w:ascii="Calibri" w:cs="Calibri" w:eastAsia="Calibri" w:hAnsi="Calibri"/>
+              </w:rPr>
+            </w:pPr>
+            <w:r>
+              <w:rPr>
+                <w:rFonts w:ascii="Calibri" w:cs="Calibri" w:eastAsia="Calibri" w:hAnsi="Calibri"/>
+                <w:rtl w:val="0"/>
+              </w:rPr>
+              <w:t xml:space="preserve">GCMB</w:t>
+            </w:r>
+          </w:p>
+        </w:tc>
+        <w:tc>
+          <w:tcPr>
+            <w:tcBorders>
+              <w:top w:color="000000" w:space="0" w:sz="4" w:val="single"/>
+              <w:left w:color="000000" w:space="0" w:sz="4" w:val="single"/>
+              <w:bottom w:color="000000" w:space="0" w:sz="4" w:val="single"/>
+              <w:right w:color="000000" w:space="0" w:sz="4" w:val="single"/>
+            </w:tcBorders>
+            <w:tcMar>
+              <w:top w:w="100.0" w:type="dxa"/>
+              <w:left w:w="100.0" w:type="dxa"/>
+              <w:bottom w:w="100.0" w:type="dxa"/>
+              <w:right w:w="100.0" w:type="dxa"/>
+            </w:tcMar>
+          </w:tcPr>
+          <w:p>
+            <w:pPr>
+              <w:spacing w:line="240" w:lineRule="auto"/>
+              <w:rPr>
+                <w:rFonts w:ascii="Calibri" w:cs="Calibri" w:eastAsia="Calibri" w:hAnsi="Calibri"/>
+              </w:rPr>
+            </w:pPr>
+            <w:r>
+              <w:rPr>
+                <w:rFonts w:ascii="Calibri" w:cs="Calibri" w:eastAsia="Calibri" w:hAnsi="Calibri"/>
+                <w:rtl w:val="0"/>
+              </w:rPr>
+              <w:t xml:space="preserve">Constraint</w:t>
+            </w:r>
+          </w:p>
+        </w:tc>
+        <w:tc>
+          <w:tcPr>
+            <w:tcBorders>
+              <w:top w:color="000000" w:space="0" w:sz="4" w:val="single"/>
+              <w:left w:color="000000" w:space="0" w:sz="4" w:val="single"/>
+              <w:bottom w:color="000000" w:space="0" w:sz="4" w:val="single"/>
+              <w:right w:color="000000" w:space="0" w:sz="4" w:val="single"/>
+            </w:tcBorders>
+            <w:tcMar>
+              <w:top w:w="100.0" w:type="dxa"/>
+              <w:left w:w="100.0" w:type="dxa"/>
+              <w:bottom w:w="100.0" w:type="dxa"/>
+              <w:right w:w="100.0" w:type="dxa"/>
+            </w:tcMar>
+          </w:tcPr>
+          <w:p>
+            <w:pPr>
+              <w:spacing w:line="240" w:lineRule="auto"/>
+              <w:rPr>
+                <w:rFonts w:ascii="Calibri" w:cs="Calibri" w:eastAsia="Calibri" w:hAnsi="Calibri"/>
+              </w:rPr>
+            </w:pPr>
+            <w:r>
+              <w:rPr>
+                <w:rFonts w:ascii="Calibri" w:cs="Calibri" w:eastAsia="Calibri" w:hAnsi="Calibri"/>
+                <w:rtl w:val="0"/>
+              </w:rPr>
+              <w:t xml:space="preserve">Confirmed password-change requirements </w:t>
             </w:r>
           </w:p>
         </w:tc>
@@ -27017,6 +27539,33 @@
       <w:sz w:val="52"/>
       <w:szCs w:val="52"/>
     </w:rPr>
+  </w:style>
+  <w:style w:type="table" w:styleId="TableNormal" w:default="1">
+    <w:name w:val="TableNormal"/>
+    <w:tblPr>
+      <w:tblCellMar>
+        <w:top w:w="100.0" w:type="dxa"/>
+        <w:left w:w="100.0" w:type="dxa"/>
+        <w:bottom w:w="100.0" w:type="dxa"/>
+        <w:right w:w="100.0" w:type="dxa"/>
+      </w:tblCellMar>
+    </w:tblPr>
+  </w:style>
+  <w:style w:type="paragraph" w:styleId="Normal" w:default="1">
+    <w:name w:val="normal"/>
+  </w:style>
+  <w:style w:type="table" w:styleId="Table1">
+    <w:basedOn w:val="TableNormal"/>
+    <w:tblPr>
+      <w:tblStyleRowBandSize w:val="1"/>
+      <w:tblStyleColBandSize w:val="1"/>
+      <w:tblCellMar>
+        <w:top w:w="0.0" w:type="dxa"/>
+        <w:left w:w="108.0" w:type="dxa"/>
+        <w:bottom w:w="0.0" w:type="dxa"/>
+        <w:right w:w="108.0" w:type="dxa"/>
+      </w:tblCellMar>
+    </w:tblPr>
   </w:style>
   <w:style w:type="paragraph" w:styleId="Subtitle">
     <w:name w:val="Subtitle"/>
@@ -27371,4 +27920,19 @@
   </a:objectDefaults>
   <a:extraClrSchemeLst/>
 </a:theme>
+</file>
+
+<file path=customXML/item1.xml><?xml version="1.0" encoding="utf-8"?>
+<go:gDocsCustomXmlDataStorage xmlns:go="http://customooxmlschemas.google.com/" xmlns:r="http://schemas.openxmlformats.org/officeDocument/2006/relationships" uri="GoogleDocsCustomDataVersion2">
+  <go:docsCustomData xmlns:go="http://customooxmlschemas.google.com/" roundtripDataSignature="AMtx7mjSoHWSe9+yPCsdBtQPaADcv3dGOg==">CgMxLjAyDmguZTBscno3MzJxdWxzOAByITF2V2hFS2cwVnRaTGJ5NnFLU1FoLVNLOWZCXzEyTmc2Vg==</go:docsCustomData>
+</go:gDocsCustomXmlDataStorage>
+</file>
+
+<file path=customXML/itemProps1.xml><?xml version="1.0" encoding="utf-8"?>
+<ds:datastoreItem xmlns:ds="http://schemas.openxmlformats.org/officeDocument/2006/customXml" ds:itemID="{11111111-1234-1234-1234-123412341234}">
+  <ds:schemaRefs>
+    <ds:schemaRef ds:uri="http://schemas.openxmlformats.org/officeDocument/2006/relationships"/>
+    <ds:schemaRef ds:uri="http://customooxmlschemas.google.com/"/>
+  </ds:schemaRefs>
+</ds:datastoreItem>
 </file>
</xml_diff>